<commit_message>
Add CIFAKE cross-domain training, evaluation, docs, and experiment artifacts
</commit_message>
<xml_diff>
--- a/AI图像检测系统_实验操作文档.docx
+++ b/AI图像检测系统_实验操作文档.docx
@@ -504,6 +504,20 @@
       <w:pPr>
         <w:spacing w:before="600" w:after="0"/>
       </w:pPr>
+      <w:r>
+        <w:rPr>
+          <w:rFonts w:hint="eastAsia"/>
+        </w:rPr>
+        <w:t>https://github.com/hyh1741</w:t>
+      </w:r>
+      <w:bookmarkStart w:id="0" w:name="_GoBack"/>
+      <w:bookmarkEnd w:id="0"/>
+      <w:r>
+        <w:rPr>
+          <w:rFonts w:hint="eastAsia"/>
+        </w:rPr>
+        <w:t>359853-beep/deepfake-detection-8307GroupProject.git</w:t>
+      </w:r>
     </w:p>
     <w:p>
       <w:r>
@@ -2926,12 +2940,6 @@
             <w:insideH w:val="single" w:color="auto" w:sz="4" w:space="0"/>
             <w:insideV w:val="single" w:color="auto" w:sz="4" w:space="0"/>
           </w:tblBorders>
-          <w:tblCellMar>
-            <w:top w:w="0" w:type="dxa"/>
-            <w:left w:w="10" w:type="dxa"/>
-            <w:bottom w:w="0" w:type="dxa"/>
-            <w:right w:w="10" w:type="dxa"/>
-          </w:tblCellMar>
         </w:tblPrEx>
         <w:tc>
           <w:tcPr>
@@ -10826,12 +10834,223 @@
           </wp:inline>
         </w:drawing>
       </w:r>
-      <w:bookmarkStart w:id="0" w:name="_GoBack"/>
-      <w:bookmarkEnd w:id="0"/>
-    </w:p>
-    <w:p>
-      <w:pPr>
-        <w:spacing w:before="120" w:after="0"/>
+    </w:p>
+    <w:p>
+      <w:pPr>
+        <w:rPr>
+          <w:rFonts w:hint="eastAsia"/>
+        </w:rPr>
+      </w:pPr>
+    </w:p>
+    <w:p>
+      <w:pPr>
+        <w:rPr>
+          <w:rFonts w:hint="default" w:eastAsia="宋体"/>
+          <w:lang w:val="en-US" w:eastAsia="zh-CN"/>
+        </w:rPr>
+      </w:pPr>
+      <w:r>
+        <w:rPr>
+          <w:rFonts w:hint="eastAsia"/>
+        </w:rPr>
+        <w:t>batch_predict.py</w:t>
+      </w:r>
+      <w:r>
+        <w:rPr>
+          <w:rFonts w:hint="eastAsia" w:eastAsia="宋体"/>
+          <w:lang w:val="en-US" w:eastAsia="zh-CN"/>
+        </w:rPr>
+        <w:t>运行结果：</w:t>
+      </w:r>
+    </w:p>
+    <w:p>
+      <w:pPr>
+        <w:rPr>
+          <w:rFonts w:hint="eastAsia"/>
+        </w:rPr>
+      </w:pPr>
+      <w:r>
+        <w:rPr>
+          <w:rFonts w:hint="eastAsia"/>
+        </w:rPr>
+        <w:t>f:/HYH_LocalFile/8307_GroupProject/batch_predict.py</w:t>
+      </w:r>
+    </w:p>
+    <w:p>
+      <w:pPr>
+        <w:rPr>
+          <w:rFonts w:hint="eastAsia"/>
+        </w:rPr>
+      </w:pPr>
+      <w:r>
+        <w:rPr>
+          <w:rFonts w:hint="eastAsia"/>
+        </w:rPr>
+        <w:t>✅ 已加载训练好的 Deepfake 检测权重</w:t>
+      </w:r>
+    </w:p>
+    <w:p>
+      <w:pPr>
+        <w:rPr>
+          <w:rFonts w:hint="eastAsia"/>
+        </w:rPr>
+      </w:pPr>
+      <w:r>
+        <w:rPr>
+          <w:rFonts w:hint="eastAsia"/>
+        </w:rPr>
+        <w:t>📁 REAL 文件夹 → 50 张图像</w:t>
+      </w:r>
+    </w:p>
+    <w:p>
+      <w:pPr>
+        <w:rPr>
+          <w:rFonts w:hint="eastAsia"/>
+        </w:rPr>
+      </w:pPr>
+      <w:r>
+        <w:rPr>
+          <w:rFonts w:hint="eastAsia"/>
+        </w:rPr>
+        <w:t>📁 FAKE 文件夹 → 50 张图像</w:t>
+      </w:r>
+    </w:p>
+    <w:p>
+      <w:pPr>
+        <w:rPr>
+          <w:rFonts w:hint="eastAsia"/>
+        </w:rPr>
+      </w:pPr>
+    </w:p>
+    <w:p>
+      <w:pPr>
+        <w:rPr>
+          <w:rFonts w:hint="eastAsia"/>
+        </w:rPr>
+      </w:pPr>
+      <w:r>
+        <w:rPr>
+          <w:rFonts w:hint="eastAsia"/>
+        </w:rPr>
+        <w:t>📊 Fake 概率分布统计：</w:t>
+      </w:r>
+    </w:p>
+    <w:p>
+      <w:pPr>
+        <w:rPr>
+          <w:rFonts w:hint="eastAsia"/>
+        </w:rPr>
+      </w:pPr>
+      <w:r>
+        <w:rPr>
+          <w:rFonts w:hint="eastAsia"/>
+        </w:rPr>
+        <w:t xml:space="preserve">            count    mean     std     min     25%     50%     75%     max</w:t>
+      </w:r>
+    </w:p>
+    <w:p>
+      <w:pPr>
+        <w:rPr>
+          <w:rFonts w:hint="eastAsia"/>
+        </w:rPr>
+      </w:pPr>
+      <w:r>
+        <w:rPr>
+          <w:rFonts w:hint="eastAsia"/>
+        </w:rPr>
+        <w:t>true_label</w:t>
+      </w:r>
+    </w:p>
+    <w:p>
+      <w:pPr>
+        <w:rPr>
+          <w:rFonts w:hint="eastAsia"/>
+        </w:rPr>
+      </w:pPr>
+      <w:r>
+        <w:rPr>
+          <w:rFonts w:hint="eastAsia"/>
+        </w:rPr>
+        <w:t>FAKE         50.0  0.8010  0.3400  0.0005  0.8872  0.9814  0.9993  1.0000</w:t>
+      </w:r>
+    </w:p>
+    <w:p>
+      <w:pPr>
+        <w:rPr>
+          <w:rFonts w:hint="eastAsia"/>
+        </w:rPr>
+      </w:pPr>
+      <w:r>
+        <w:rPr>
+          <w:rFonts w:hint="eastAsia"/>
+        </w:rPr>
+        <w:t>REAL         50.0  0.2339  0.3259  0.0000  0.0021  0.0348  0.3490  0.9967</w:t>
+      </w:r>
+    </w:p>
+    <w:p>
+      <w:pPr>
+        <w:rPr>
+          <w:rFonts w:hint="eastAsia"/>
+        </w:rPr>
+      </w:pPr>
+    </w:p>
+    <w:p>
+      <w:pPr>
+        <w:rPr>
+          <w:rFonts w:hint="eastAsia"/>
+        </w:rPr>
+      </w:pPr>
+      <w:r>
+        <w:rPr>
+          <w:rFonts w:hint="eastAsia"/>
+        </w:rPr>
+        <w:t>🎯 分类准确率：</w:t>
+      </w:r>
+    </w:p>
+    <w:p>
+      <w:pPr>
+        <w:rPr>
+          <w:rFonts w:hint="eastAsia"/>
+        </w:rPr>
+      </w:pPr>
+      <w:r>
+        <w:rPr>
+          <w:rFonts w:hint="eastAsia"/>
+        </w:rPr>
+        <w:t xml:space="preserve">  REAL: 78.0%  (39/50 正确)</w:t>
+      </w:r>
+    </w:p>
+    <w:p>
+      <w:pPr>
+        <w:rPr>
+          <w:rFonts w:hint="eastAsia"/>
+        </w:rPr>
+      </w:pPr>
+      <w:r>
+        <w:rPr>
+          <w:rFonts w:hint="eastAsia"/>
+        </w:rPr>
+        <w:t xml:space="preserve">  FAKE: 84.0%  (42/50 正确)</w:t>
+      </w:r>
+    </w:p>
+    <w:p>
+      <w:pPr>
+        <w:rPr>
+          <w:rFonts w:hint="eastAsia"/>
+        </w:rPr>
+      </w:pPr>
+      <w:r>
+        <w:rPr>
+          <w:rFonts w:hint="eastAsia"/>
+        </w:rPr>
+        <w:t xml:space="preserve">  总体准确率: 81.0%</w:t>
+      </w:r>
+    </w:p>
+    <w:p>
+      <w:pPr>
+        <w:rPr>
+          <w:rFonts w:hint="eastAsia"/>
+        </w:rPr>
       </w:pPr>
     </w:p>
     <w:p>
@@ -11481,6 +11700,10 @@
           <w:bottom w:val="single" w:color="2E75B6" w:sz="8" w:space="4"/>
         </w:pBdr>
         <w:spacing w:before="360" w:after="180"/>
+        <w:rPr>
+          <w:rFonts w:hint="default" w:eastAsia="宋体"/>
+          <w:lang w:val="en-US" w:eastAsia="zh-CN"/>
+        </w:rPr>
       </w:pPr>
       <w:r>
         <w:rPr>
@@ -11492,6 +11715,18 @@
           <w:szCs w:val="32"/>
         </w:rPr>
         <w:t>第八章  扩展实验：AI 生成概率 vs Prompt 复杂度</w:t>
+      </w:r>
+      <w:r>
+        <w:rPr>
+          <w:rFonts w:hint="eastAsia" w:eastAsia="宋体" w:cs="Arial"/>
+          <w:b/>
+          <w:bCs/>
+          <w:color w:val="1F4E79"/>
+          <w:sz w:val="32"/>
+          <w:szCs w:val="32"/>
+          <w:lang w:val="en-US" w:eastAsia="zh-CN"/>
+        </w:rPr>
+        <w:t>(还没做，可以是拓展方向)</w:t>
       </w:r>
     </w:p>
     <w:p>
@@ -11570,6 +11805,12 @@
             <w:insideH w:val="single" w:color="auto" w:sz="4" w:space="0"/>
             <w:insideV w:val="single" w:color="auto" w:sz="4" w:space="0"/>
           </w:tblBorders>
+          <w:tblCellMar>
+            <w:top w:w="0" w:type="dxa"/>
+            <w:left w:w="10" w:type="dxa"/>
+            <w:bottom w:w="0" w:type="dxa"/>
+            <w:right w:w="10" w:type="dxa"/>
+          </w:tblCellMar>
         </w:tblPrEx>
         <w:tc>
           <w:tcPr>
@@ -12777,11 +13018,6 @@
         </w:tc>
       </w:tr>
     </w:tbl>
-    <w:p>
-      <w:pPr>
-        <w:spacing w:before="120" w:after="0"/>
-      </w:pPr>
-    </w:p>
     <w:p>
       <w:r>
         <w:br w:type="page"/>
@@ -14193,7 +14429,7 @@
   <w:docDefaults>
     <w:rPrDefault>
       <w:rPr>
-        <w:rFonts w:ascii="Arial" w:hAnsi="Arial" w:eastAsia="Arial" w:cs="Arial"/>
+        <w:rFonts w:ascii="Times New Roman" w:hAnsi="Times New Roman" w:eastAsia="宋体" w:cs="Times New Roman"/>
       </w:rPr>
     </w:rPrDefault>
     <w:pPrDefault/>

</xml_diff>